<commit_message>
Project Part 4 Commit 1
</commit_message>
<xml_diff>
--- a/products/manuscript/Manuscript.docx
+++ b/products/manuscript/Manuscript.docx
@@ -806,7 +806,7 @@
     </w:p>
     <w:bookmarkEnd w:id="24"/>
     <w:bookmarkEnd w:id="25"/>
-    <w:bookmarkStart w:id="34" w:name="methods"/>
+    <w:bookmarkStart w:id="29" w:name="methods"/>
     <w:p>
       <w:pPr>
         <w:pStyle w:val="Heading1"/>
@@ -827,13 +827,13 @@
         <w:t xml:space="preserve">Describe your methods. That should describe the data, the cleaning processes, and the analysis approaches. You might want to provide a shorter description here and all the details in the supplement.</w:t>
       </w:r>
     </w:p>
-    <w:bookmarkStart w:id="30" w:name="schematic-of-workflow"/>
+    <w:bookmarkStart w:id="26" w:name="data-acquisition"/>
     <w:p>
       <w:pPr>
         <w:pStyle w:val="Heading2"/>
       </w:pPr>
       <w:r>
-        <w:t xml:space="preserve">3.1 Schematic of workflow</w:t>
+        <w:t xml:space="preserve">3.1 Data acquisition</w:t>
       </w:r>
     </w:p>
     <w:p>
@@ -841,45 +841,80 @@
         <w:pStyle w:val="FirstParagraph"/>
       </w:pPr>
       <w:r>
-        <w:t xml:space="preserve">Sometimes you might want to show a schematic diagram/figure that was not created with code (if you can do it with code, do it).</w:t>
-      </w:r>
-      <w:r>
-        <w:t xml:space="preserve"> </w:t>
-      </w:r>
-      <w:hyperlink w:anchor="fig-schematic">
-        <w:r>
-          <w:rPr>
-            <w:rStyle w:val="Hyperlink"/>
-          </w:rPr>
-          <w:t xml:space="preserve">Figure 1</w:t>
-        </w:r>
-      </w:hyperlink>
-      <w:r>
-        <w:t xml:space="preserve"> </w:t>
-      </w:r>
-      <w:r>
-        <w:t xml:space="preserve">is an example of some - completely random/unrelated - schematic that was generated with BioRender.</w:t>
-      </w:r>
-      <w:r>
-        <w:t xml:space="preserve"> </w:t>
-      </w:r>
-      <w:r>
-        <w:t xml:space="preserve">We store those figures in the</w:t>
-      </w:r>
-      <w:r>
-        <w:t xml:space="preserve"> </w:t>
-      </w:r>
-      <w:r>
         <w:rPr>
-          <w:rStyle w:val="VerbatimChar"/>
+          <w:i/>
+          <w:iCs/>
         </w:rPr>
-        <w:t xml:space="preserve">assets</w:t>
-      </w:r>
-      <w:r>
-        <w:t xml:space="preserve"> </w:t>
-      </w:r>
-      <w:r>
-        <w:t xml:space="preserve">folder.</w:t>
+        <w:t xml:space="preserve">As applicable, explain where and how you got the data. If you directly import the data from an online source, you can combine this section with the next.</w:t>
+      </w:r>
+    </w:p>
+    <w:bookmarkEnd w:id="26"/>
+    <w:bookmarkStart w:id="27" w:name="data-import-and-cleaning"/>
+    <w:p>
+      <w:pPr>
+        <w:pStyle w:val="Heading2"/>
+      </w:pPr>
+      <w:r>
+        <w:t xml:space="preserve">3.2 Data import and cleaning</w:t>
+      </w:r>
+    </w:p>
+    <w:p>
+      <w:pPr>
+        <w:pStyle w:val="FirstParagraph"/>
+      </w:pPr>
+      <w:r>
+        <w:t xml:space="preserve">Missing information in the form of whitespace and -9 were converted to missing data. Columns that contained numeric information (e.g., total_seed_weight, seed_per_pound, etc.) but classified as characters were converted to numeric data. A subset of the data was created to contain variables necessary for this study: year, location, watered, variety, peanut_yield. Peanut variety names were converted to numbers to keep specific variety performance confidential as requested by the data provider. Lastly, entries with missing data were removed and only varieties grown in all four (4) locations were kept.</w:t>
+      </w:r>
+    </w:p>
+    <w:bookmarkEnd w:id="27"/>
+    <w:bookmarkStart w:id="28" w:name="statistical-analysis"/>
+    <w:p>
+      <w:pPr>
+        <w:pStyle w:val="Heading2"/>
+      </w:pPr>
+      <w:r>
+        <w:t xml:space="preserve">3.3 Statistical analysis</w:t>
+      </w:r>
+    </w:p>
+    <w:p>
+      <w:pPr>
+        <w:pStyle w:val="FirstParagraph"/>
+      </w:pPr>
+      <w:r>
+        <w:t xml:space="preserve">Peanut yield was analyzed as a continuous response variable to evaluate the effects of variety, location, and irrigation treatment. Differences in yield among peanut varieties and among locations were assessed using analysis of variance (ANOVA). To account for environmental variation, models included year and location effects where appropriate. Differences in yield between irrigated and non-irrigated conditions were evaluated using a two-sample t-test. All statistical analyses were assessed at α = 0.05.</w:t>
+      </w:r>
+    </w:p>
+    <w:p>
+      <w:r>
+        <w:br w:type="page"/>
+      </w:r>
+    </w:p>
+    <w:bookmarkEnd w:id="28"/>
+    <w:bookmarkEnd w:id="29"/>
+    <w:bookmarkStart w:id="53" w:name="results"/>
+    <w:p>
+      <w:pPr>
+        <w:pStyle w:val="Heading1"/>
+      </w:pPr>
+      <w:r>
+        <w:t xml:space="preserve">4. Results</w:t>
+      </w:r>
+    </w:p>
+    <w:bookmarkStart w:id="47" w:name="exploratorydescriptive-analysis"/>
+    <w:p>
+      <w:pPr>
+        <w:pStyle w:val="Heading2"/>
+      </w:pPr>
+      <w:r>
+        <w:t xml:space="preserve">4.1 Exploratory/Descriptive analysis</w:t>
+      </w:r>
+    </w:p>
+    <w:p>
+      <w:pPr>
+        <w:pStyle w:val="FirstParagraph"/>
+      </w:pPr>
+      <w:r>
+        <w:t xml:space="preserve">Peanut yield varied widely among the tested varieties (Figure 2). Median yield values spanned a broad range, from 799 to 9,171 lb/acre. While many varieties clustered around intermediate yields (~4,000–6,000 lb/acre), several varieties exhibited consistently higher or lower performance. Substantial within-variety variability was also observed, as indicated by the spread of the boxplots and presence of outliers. Overall, these results suggest considerable differences in yield potential among peanut varieties.</w:t>
       </w:r>
     </w:p>
     <w:tbl>
@@ -895,7 +930,7 @@
       <w:tr>
         <w:tc>
           <w:tcPr/>
-          <w:bookmarkStart w:id="29" w:name="fig-schematic"/>
+          <w:bookmarkStart w:id="33" w:name="fig-eda1"/>
           <w:p>
             <w:pPr>
               <w:pStyle w:val="Compact"/>
@@ -904,20 +939,20 @@
             <w:r>
               <w:drawing>
                 <wp:inline>
-                  <wp:extent cx="5334000" cy="4978399"/>
+                  <wp:extent cx="5334000" cy="3807460"/>
                   <wp:effectExtent b="0" l="0" r="0" t="0"/>
-                  <wp:docPr descr="" title="" id="27" name="Picture"/>
+                  <wp:docPr descr="" title="" id="31" name="Picture"/>
                   <a:graphic>
                     <a:graphicData uri="http://schemas.openxmlformats.org/drawingml/2006/picture">
                       <pic:pic>
                         <pic:nvPicPr>
-                          <pic:cNvPr descr="../../assets/antigen-recognition.png" id="28" name="Picture"/>
+                          <pic:cNvPr descr="../../results/figures/eda_p1.png" id="32" name="Picture"/>
                           <pic:cNvPicPr>
                             <a:picLocks noChangeArrowheads="1" noChangeAspect="1"/>
                           </pic:cNvPicPr>
                         </pic:nvPicPr>
                         <pic:blipFill>
-                          <a:blip r:embed="rId26"/>
+                          <a:blip r:embed="rId30"/>
                           <a:stretch>
                             <a:fillRect/>
                           </a:stretch>
@@ -925,7 +960,7 @@
                         <pic:spPr bwMode="auto">
                           <a:xfrm>
                             <a:off x="0" y="0"/>
-                            <a:ext cx="5334000" cy="4978399"/>
+                            <a:ext cx="5334000" cy="3807460"/>
                           </a:xfrm>
                           <a:prstGeom prst="rect">
                             <a:avLst/>
@@ -954,102 +989,19 @@
               <w:pStyle w:val="ImageCaption"/>
             </w:pPr>
             <w:r>
-              <w:t xml:space="preserve">Figure 1: A figure that is manually generated and shows some overview/schematic. This has nothing to do with the data, it’s just a random one from one of our projects I found and placed here.</w:t>
+              <w:t xml:space="preserve">Figure 1: Yield by variety.</w:t>
             </w:r>
           </w:p>
-          <w:bookmarkEnd w:id="29"/>
+          <w:bookmarkEnd w:id="33"/>
         </w:tc>
       </w:tr>
     </w:tbl>
-    <w:bookmarkEnd w:id="30"/>
-    <w:bookmarkStart w:id="31" w:name="data-acquisition"/>
-    <w:p>
-      <w:pPr>
-        <w:pStyle w:val="Heading2"/>
-      </w:pPr>
-      <w:r>
-        <w:t xml:space="preserve">3.2 Data acquisition</w:t>
-      </w:r>
-    </w:p>
-    <w:p>
-      <w:pPr>
-        <w:pStyle w:val="FirstParagraph"/>
-      </w:pPr>
-      <w:r>
-        <w:rPr>
-          <w:i/>
-          <w:iCs/>
-        </w:rPr>
-        <w:t xml:space="preserve">As applicable, explain where and how you got the data. If you directly import the data from an online source, you can combine this section with the next.</w:t>
-      </w:r>
-    </w:p>
-    <w:bookmarkEnd w:id="31"/>
-    <w:bookmarkStart w:id="32" w:name="data-import-and-cleaning"/>
-    <w:p>
-      <w:pPr>
-        <w:pStyle w:val="Heading2"/>
-      </w:pPr>
-      <w:r>
-        <w:t xml:space="preserve">3.3 Data import and cleaning</w:t>
-      </w:r>
-    </w:p>
-    <w:p>
-      <w:pPr>
-        <w:pStyle w:val="FirstParagraph"/>
-      </w:pPr>
-      <w:r>
-        <w:t xml:space="preserve">Missing information in the form of whitespace and -9 were converted to missing data. Columns that contained numeric information (e.g., total_seed_weight, seed_per_pound, etc.) but classified as characters were converted to numeric data. A subset of the data was created to contain variables necessary for this study: year, location, watered, variety, peanut_yield. Peanut variety names were converted to numbers to keep specific variety performance confidential as requested by the data provider. Lastly, entries with missing data were removed and only varieties grown in all four (4) locations were kept.</w:t>
-      </w:r>
-    </w:p>
-    <w:bookmarkEnd w:id="32"/>
-    <w:bookmarkStart w:id="33" w:name="statistical-analysis"/>
-    <w:p>
-      <w:pPr>
-        <w:pStyle w:val="Heading2"/>
-      </w:pPr>
-      <w:r>
-        <w:t xml:space="preserve">3.4 Statistical analysis</w:t>
-      </w:r>
-    </w:p>
-    <w:p>
-      <w:pPr>
-        <w:pStyle w:val="FirstParagraph"/>
-      </w:pPr>
-      <w:r>
-        <w:t xml:space="preserve">Peanut yield was analyzed as a continuous response variable to evaluate the effects of variety, location, and irrigation treatment. Differences in yield among peanut varieties and among locations were assessed using analysis of variance (ANOVA). To account for environmental variation, models included year and location effects where appropriate. Differences in yield between irrigated and non-irrigated conditions were evaluated using a two-sample t-test. All statistical analyses were assessed at α = 0.05.</w:t>
-      </w:r>
-    </w:p>
-    <w:p>
-      <w:r>
-        <w:br w:type="page"/>
-      </w:r>
-    </w:p>
-    <w:bookmarkEnd w:id="33"/>
-    <w:bookmarkEnd w:id="34"/>
-    <w:bookmarkStart w:id="58" w:name="results"/>
-    <w:p>
-      <w:pPr>
-        <w:pStyle w:val="Heading1"/>
-      </w:pPr>
-      <w:r>
-        <w:t xml:space="preserve">4. Results</w:t>
-      </w:r>
-    </w:p>
-    <w:bookmarkStart w:id="52" w:name="exploratorydescriptive-analysis"/>
-    <w:p>
-      <w:pPr>
-        <w:pStyle w:val="Heading2"/>
-      </w:pPr>
-      <w:r>
-        <w:t xml:space="preserve">4.1 Exploratory/Descriptive analysis</w:t>
-      </w:r>
-    </w:p>
-    <w:p>
-      <w:pPr>
-        <w:pStyle w:val="FirstParagraph"/>
-      </w:pPr>
-      <w:r>
-        <w:t xml:space="preserve">Peanut yield varied widely among the tested varieties (Figure 2). Median yield values spanned a broad range, from 799 to 9,171 lb/acre. While many varieties clustered around intermediate yields (~4,000–6,000 lb/acre), several varieties exhibited consistently higher or lower performance. Substantial within-variety variability was also observed, as indicated by the spread of the boxplots and presence of outliers. Overall, these results suggest considerable differences in yield potential among peanut varieties.</w:t>
+    <w:p>
+      <w:pPr>
+        <w:pStyle w:val="BodyText"/>
+      </w:pPr>
+      <w:r>
+        <w:t xml:space="preserve">Peanut yield differed between irrigated and non-irrigated conditions (Figure 3). Irrigated plots (watered = TRUE) exhibited a higher median yield compared to non-irrigated plots (watered = FALSE). The distribution of yields under irrigation was also shifted upward, with a greater proportion of observations exceeding 5,000 lb/acre. Although variability was present in both groups, the overall pattern indicates that irrigation is associated with increased peanut yield.</w:t>
       </w:r>
     </w:p>
     <w:tbl>
@@ -1065,7 +1017,7 @@
       <w:tr>
         <w:tc>
           <w:tcPr/>
-          <w:bookmarkStart w:id="38" w:name="fig-eda1"/>
+          <w:bookmarkStart w:id="37" w:name="fig-eda2"/>
           <w:p>
             <w:pPr>
               <w:pStyle w:val="Compact"/>
@@ -1076,18 +1028,18 @@
                 <wp:inline>
                   <wp:extent cx="5334000" cy="5334000"/>
                   <wp:effectExtent b="0" l="0" r="0" t="0"/>
-                  <wp:docPr descr="" title="" id="36" name="Picture"/>
+                  <wp:docPr descr="" title="" id="35" name="Picture"/>
                   <a:graphic>
                     <a:graphicData uri="http://schemas.openxmlformats.org/drawingml/2006/picture">
                       <pic:pic>
                         <pic:nvPicPr>
-                          <pic:cNvPr descr="../../results/figures/eda1.png" id="37" name="Picture"/>
+                          <pic:cNvPr descr="../../results/figures/eda_p2.png" id="36" name="Picture"/>
                           <pic:cNvPicPr>
                             <a:picLocks noChangeArrowheads="1" noChangeAspect="1"/>
                           </pic:cNvPicPr>
                         </pic:nvPicPr>
                         <pic:blipFill>
-                          <a:blip r:embed="rId35"/>
+                          <a:blip r:embed="rId34"/>
                           <a:stretch>
                             <a:fillRect/>
                           </a:stretch>
@@ -1124,10 +1076,10 @@
               <w:pStyle w:val="ImageCaption"/>
             </w:pPr>
             <w:r>
-              <w:t xml:space="preserve">Figure 2: Yield by variety.</w:t>
+              <w:t xml:space="preserve">Figure 2: Yield by irrigation.</w:t>
             </w:r>
           </w:p>
-          <w:bookmarkEnd w:id="38"/>
+          <w:bookmarkEnd w:id="37"/>
         </w:tc>
       </w:tr>
     </w:tbl>
@@ -1136,7 +1088,7 @@
         <w:pStyle w:val="BodyText"/>
       </w:pPr>
       <w:r>
-        <w:t xml:space="preserve">Peanut yield differed between irrigated and non-irrigated conditions (Figure 3). Irrigated plots (watered = TRUE) exhibited a higher median yield compared to non-irrigated plots (watered = FALSE). The distribution of yields under irrigation was also shifted upward, with a greater proportion of observations exceeding 5,000 lb/acre. Although variability was present in both groups, the overall pattern indicates that irrigation is associated with increased peanut yield.</w:t>
+        <w:t xml:space="preserve">Yield varied across the four testing locations (Figure 4). Attapulgus exhibited the highest median yield, with values generally concentrated between 6,000 and 7,000 lb/acre. In contrast, Plains showed the lowest median yield and greater variability, with many observations below 5,000 lb/acre. Midville and Tifton displayed intermediate yield distributions, though Midville exhibited a wider spread, including both low and high yield observations. These differences highlight the influence of location on peanut yield performance.</w:t>
       </w:r>
     </w:p>
     <w:tbl>
@@ -1152,7 +1104,7 @@
       <w:tr>
         <w:tc>
           <w:tcPr/>
-          <w:bookmarkStart w:id="42" w:name="fig-eda2"/>
+          <w:bookmarkStart w:id="41" w:name="fig-eda3"/>
           <w:p>
             <w:pPr>
               <w:pStyle w:val="Compact"/>
@@ -1163,18 +1115,18 @@
                 <wp:inline>
                   <wp:extent cx="5334000" cy="5334000"/>
                   <wp:effectExtent b="0" l="0" r="0" t="0"/>
-                  <wp:docPr descr="" title="" id="40" name="Picture"/>
+                  <wp:docPr descr="" title="" id="39" name="Picture"/>
                   <a:graphic>
                     <a:graphicData uri="http://schemas.openxmlformats.org/drawingml/2006/picture">
                       <pic:pic>
                         <pic:nvPicPr>
-                          <pic:cNvPr descr="../../results/figures/eda2.png" id="41" name="Picture"/>
+                          <pic:cNvPr descr="../../results/figures/eda_p3.png" id="40" name="Picture"/>
                           <pic:cNvPicPr>
                             <a:picLocks noChangeArrowheads="1" noChangeAspect="1"/>
                           </pic:cNvPicPr>
                         </pic:nvPicPr>
                         <pic:blipFill>
-                          <a:blip r:embed="rId39"/>
+                          <a:blip r:embed="rId38"/>
                           <a:stretch>
                             <a:fillRect/>
                           </a:stretch>
@@ -1211,10 +1163,10 @@
               <w:pStyle w:val="ImageCaption"/>
             </w:pPr>
             <w:r>
-              <w:t xml:space="preserve">Figure 3: Yield by irrigation.</w:t>
+              <w:t xml:space="preserve">Figure 3: Yield by location.</w:t>
             </w:r>
           </w:p>
-          <w:bookmarkEnd w:id="42"/>
+          <w:bookmarkEnd w:id="41"/>
         </w:tc>
       </w:tr>
     </w:tbl>
@@ -1223,7 +1175,7 @@
         <w:pStyle w:val="BodyText"/>
       </w:pPr>
       <w:r>
-        <w:t xml:space="preserve">Yield varied across the four testing locations (Figure 4). Attapulgus exhibited the highest median yield, with values generally concentrated between 6,000 and 7,000 lb/acre. In contrast, Plains showed the lowest median yield and greater variability, with many observations below 5,000 lb/acre. Midville and Tifton displayed intermediate yield distributions, though Midville exhibited a wider spread, including both low and high yield observations. These differences highlight the influence of location on peanut yield performance.</w:t>
+        <w:t xml:space="preserve">Temporal patterns in yield varied by location (Figure 5). In Midville, yield showed a general upward trend over time, particularly in the later years. Attapulgus exhibited relatively high yields, though limited observations were available. Plains displayed substantial year-to-year variability with no clear long-term trend, while Tifton showed moderate fluctuations, including a notable decline around 2020 followed by recovery in subsequent years.</w:t>
       </w:r>
     </w:p>
     <w:tbl>
@@ -1239,7 +1191,7 @@
       <w:tr>
         <w:tc>
           <w:tcPr/>
-          <w:bookmarkStart w:id="46" w:name="fig-eda3"/>
+          <w:bookmarkStart w:id="45" w:name="fig-eda4"/>
           <w:p>
             <w:pPr>
               <w:pStyle w:val="Compact"/>
@@ -1250,18 +1202,18 @@
                 <wp:inline>
                   <wp:extent cx="5334000" cy="5334000"/>
                   <wp:effectExtent b="0" l="0" r="0" t="0"/>
-                  <wp:docPr descr="" title="" id="44" name="Picture"/>
+                  <wp:docPr descr="" title="" id="43" name="Picture"/>
                   <a:graphic>
                     <a:graphicData uri="http://schemas.openxmlformats.org/drawingml/2006/picture">
                       <pic:pic>
                         <pic:nvPicPr>
-                          <pic:cNvPr descr="../../results/figures/eda3.png" id="45" name="Picture"/>
+                          <pic:cNvPr descr="../../results/figures/eda_p4.png" id="44" name="Picture"/>
                           <pic:cNvPicPr>
                             <a:picLocks noChangeArrowheads="1" noChangeAspect="1"/>
                           </pic:cNvPicPr>
                         </pic:nvPicPr>
                         <pic:blipFill>
-                          <a:blip r:embed="rId43"/>
+                          <a:blip r:embed="rId42"/>
                           <a:stretch>
                             <a:fillRect/>
                           </a:stretch>
@@ -1298,10 +1250,10 @@
               <w:pStyle w:val="ImageCaption"/>
             </w:pPr>
             <w:r>
-              <w:t xml:space="preserve">Figure 4: Yield by location.</w:t>
+              <w:t xml:space="preserve">Figure 4: Yield across years by location.</w:t>
             </w:r>
           </w:p>
-          <w:bookmarkEnd w:id="46"/>
+          <w:bookmarkEnd w:id="45"/>
         </w:tc>
       </w:tr>
     </w:tbl>
@@ -1309,8 +1261,19 @@
       <w:pPr>
         <w:pStyle w:val="BodyText"/>
       </w:pPr>
-      <w:r>
-        <w:t xml:space="preserve">Temporal patterns in yield varied by location (Figure 5). In Midville, yield showed a general upward trend over time, particularly in the later years. Attapulgus exhibited relatively high yields, though limited observations were available. Plains displayed substantial year-to-year variability with no clear long-term trend, while Tifton showed moderate fluctuations, including a notable decline around 2020 followed by recovery in subsequent years.</w:t>
+      <w:hyperlink w:anchor="tbl-summarytable">
+        <w:r>
+          <w:rPr>
+            <w:rStyle w:val="Hyperlink"/>
+          </w:rPr>
+          <w:t xml:space="preserve">Table 2</w:t>
+        </w:r>
+      </w:hyperlink>
+      <w:r>
+        <w:t xml:space="preserve"> </w:t>
+      </w:r>
+      <w:r>
+        <w:t xml:space="preserve">shows a summary of the data.</w:t>
       </w:r>
     </w:p>
     <w:tbl>
@@ -1326,205 +1289,7 @@
       <w:tr>
         <w:tc>
           <w:tcPr/>
-          <w:bookmarkStart w:id="50" w:name="fig-eda4"/>
-          <w:p>
-            <w:pPr>
-              <w:pStyle w:val="Compact"/>
-              <w:jc w:val="center"/>
-            </w:pPr>
-            <w:r>
-              <w:drawing>
-                <wp:inline>
-                  <wp:extent cx="5334000" cy="5334000"/>
-                  <wp:effectExtent b="0" l="0" r="0" t="0"/>
-                  <wp:docPr descr="" title="" id="48" name="Picture"/>
-                  <a:graphic>
-                    <a:graphicData uri="http://schemas.openxmlformats.org/drawingml/2006/picture">
-                      <pic:pic>
-                        <pic:nvPicPr>
-                          <pic:cNvPr descr="../../results/figures/eda4.png" id="49" name="Picture"/>
-                          <pic:cNvPicPr>
-                            <a:picLocks noChangeArrowheads="1" noChangeAspect="1"/>
-                          </pic:cNvPicPr>
-                        </pic:nvPicPr>
-                        <pic:blipFill>
-                          <a:blip r:embed="rId47"/>
-                          <a:stretch>
-                            <a:fillRect/>
-                          </a:stretch>
-                        </pic:blipFill>
-                        <pic:spPr bwMode="auto">
-                          <a:xfrm>
-                            <a:off x="0" y="0"/>
-                            <a:ext cx="5334000" cy="5334000"/>
-                          </a:xfrm>
-                          <a:prstGeom prst="rect">
-                            <a:avLst/>
-                          </a:prstGeom>
-                          <a:noFill/>
-                          <a:ln w="9525">
-                            <a:noFill/>
-                            <a:headEnd/>
-                            <a:tailEnd/>
-                          </a:ln>
-                        </pic:spPr>
-                      </pic:pic>
-                    </a:graphicData>
-                  </a:graphic>
-                </wp:inline>
-              </w:drawing>
-            </w:r>
-          </w:p>
-          <w:p>
-            <w:pPr>
-              <w:jc w:val="center"/>
-            </w:pPr>
-            <w:pPr>
-              <w:jc w:val="left"/>
-              <w:spacing w:before="200"/>
-              <w:pStyle w:val="ImageCaption"/>
-            </w:pPr>
-            <w:r>
-              <w:t xml:space="preserve">Figure 5: Yield across years by location.</w:t>
-            </w:r>
-          </w:p>
-          <w:bookmarkEnd w:id="50"/>
-        </w:tc>
-      </w:tr>
-    </w:tbl>
-    <w:p>
-      <w:pPr>
-        <w:pStyle w:val="BodyText"/>
-      </w:pPr>
-      <w:hyperlink w:anchor="tbl-summarytable">
-        <w:r>
-          <w:rPr>
-            <w:rStyle w:val="Hyperlink"/>
-          </w:rPr>
-          <w:t xml:space="preserve">Table 2</w:t>
-        </w:r>
-      </w:hyperlink>
-      <w:r>
-        <w:t xml:space="preserve"> </w:t>
-      </w:r>
-      <w:r>
-        <w:t xml:space="preserve">shows a summary of the data.</w:t>
-      </w:r>
-    </w:p>
-    <w:p>
-      <w:pPr>
-        <w:pStyle w:val="BodyText"/>
-      </w:pPr>
-      <w:r>
-        <w:t xml:space="preserve">Note the loading of the data providing a</w:t>
-      </w:r>
-      <w:r>
-        <w:t xml:space="preserve"> </w:t>
-      </w:r>
-      <w:r>
-        <w:rPr>
-          <w:b/>
-          <w:bCs/>
-        </w:rPr>
-        <w:t xml:space="preserve">relative</w:t>
-      </w:r>
-      <w:r>
-        <w:t xml:space="preserve"> </w:t>
-      </w:r>
-      <w:r>
-        <w:t xml:space="preserve">path using the</w:t>
-      </w:r>
-      <w:r>
-        <w:t xml:space="preserve"> </w:t>
-      </w:r>
-      <w:r>
-        <w:rPr>
-          <w:rStyle w:val="VerbatimChar"/>
-        </w:rPr>
-        <w:t xml:space="preserve">../../</w:t>
-      </w:r>
-      <w:r>
-        <w:t xml:space="preserve"> </w:t>
-      </w:r>
-      <w:r>
-        <w:t xml:space="preserve">notation. (Two dots means a folder up). You never want to specify an</w:t>
-      </w:r>
-      <w:r>
-        <w:t xml:space="preserve"> </w:t>
-      </w:r>
-      <w:r>
-        <w:rPr>
-          <w:b/>
-          <w:bCs/>
-        </w:rPr>
-        <w:t xml:space="preserve">absolute</w:t>
-      </w:r>
-      <w:r>
-        <w:t xml:space="preserve"> </w:t>
-      </w:r>
-      <w:r>
-        <w:t xml:space="preserve">path like</w:t>
-      </w:r>
-      <w:r>
-        <w:t xml:space="preserve"> </w:t>
-      </w:r>
-      <w:r>
-        <w:rPr>
-          <w:rStyle w:val="VerbatimChar"/>
-        </w:rPr>
-        <w:t xml:space="preserve">C:\ahandel\myproject\results\</w:t>
-      </w:r>
-      <w:r>
-        <w:t xml:space="preserve"> </w:t>
-      </w:r>
-      <w:r>
-        <w:t xml:space="preserve">because if you share this with someone, it won’t work for them since they don’t have that path. You can also use the</w:t>
-      </w:r>
-      <w:r>
-        <w:t xml:space="preserve"> </w:t>
-      </w:r>
-      <w:r>
-        <w:rPr>
-          <w:rStyle w:val="VerbatimChar"/>
-        </w:rPr>
-        <w:t xml:space="preserve">here</w:t>
-      </w:r>
-      <w:r>
-        <w:t xml:space="preserve"> </w:t>
-      </w:r>
-      <w:r>
-        <w:t xml:space="preserve">R package to create paths. See examples of that below. I generally recommend the</w:t>
-      </w:r>
-      <w:r>
-        <w:t xml:space="preserve"> </w:t>
-      </w:r>
-      <w:r>
-        <w:rPr>
-          <w:rStyle w:val="VerbatimChar"/>
-        </w:rPr>
-        <w:t xml:space="preserve">here</w:t>
-      </w:r>
-      <w:r>
-        <w:t xml:space="preserve"> </w:t>
-      </w:r>
-      <w:r>
-        <w:t xml:space="preserve">package.</w:t>
-      </w:r>
-    </w:p>
-    <w:tbl>
-      <w:tblPr>
-        <w:tblStyle w:val="Table"/>
-        <w:tblW w:type="pct" w:w="5000"/>
-        <w:tblLayout w:type="fixed"/>
-        <w:tblLook w:firstRow="0" w:lastRow="0" w:firstColumn="0" w:lastColumn="0" w:noHBand="0" w:noVBand="0" w:val="0000"/>
-      </w:tblPr>
-      <w:tblGrid>
-        <w:gridCol w:w="7920"/>
-      </w:tblGrid>
-      <w:tr>
-        <w:tc>
-          <w:tcPr/>
-          <w:bookmarkStart w:id="51" w:name="tbl-summarytable"/>
+          <w:bookmarkStart w:id="46" w:name="tbl-summarytable"/>
           <w:p>
             <w:pPr>
               <w:jc w:val="center"/>
@@ -1635,13 +1400,13 @@
               </w:tc>
             </w:tr>
           </w:tbl>
-          <w:bookmarkEnd w:id="51"/>
+          <w:bookmarkEnd w:id="46"/>
           <w:p/>
         </w:tc>
       </w:tr>
     </w:tbl>
-    <w:bookmarkEnd w:id="52"/>
-    <w:bookmarkStart w:id="56" w:name="basic-statistical-analysis"/>
+    <w:bookmarkEnd w:id="47"/>
+    <w:bookmarkStart w:id="51" w:name="basic-statistical-analysis"/>
     <w:p>
       <w:pPr>
         <w:pStyle w:val="Heading2"/>
@@ -1671,7 +1436,7 @@
       <w:tr>
         <w:tc>
           <w:tcPr/>
-          <w:bookmarkStart w:id="53" w:name="tbl-resulttable2"/>
+          <w:bookmarkStart w:id="48" w:name="tbl-resulttable2"/>
           <w:p>
             <w:pPr>
               <w:jc w:val="center"/>
@@ -1943,7 +1708,7 @@
               </w:tc>
             </w:tr>
           </w:tbl>
-          <w:bookmarkEnd w:id="53"/>
+          <w:bookmarkEnd w:id="48"/>
           <w:p/>
         </w:tc>
       </w:tr>
@@ -1969,7 +1734,7 @@
       <w:tr>
         <w:tc>
           <w:tcPr/>
-          <w:bookmarkStart w:id="54" w:name="tbl-resulttable3"/>
+          <w:bookmarkStart w:id="49" w:name="tbl-resulttable3"/>
           <w:p>
             <w:pPr>
               <w:jc w:val="center"/>
@@ -2241,7 +2006,7 @@
               </w:tc>
             </w:tr>
           </w:tbl>
-          <w:bookmarkEnd w:id="54"/>
+          <w:bookmarkEnd w:id="49"/>
           <w:p/>
         </w:tc>
       </w:tr>
@@ -2267,7 +2032,7 @@
       <w:tr>
         <w:tc>
           <w:tcPr/>
-          <w:bookmarkStart w:id="55" w:name="tbl-resulttable4"/>
+          <w:bookmarkStart w:id="50" w:name="tbl-resulttable4"/>
           <w:p>
             <w:pPr>
               <w:jc w:val="center"/>
@@ -2568,13 +2333,13 @@
               </w:tc>
             </w:tr>
           </w:tbl>
-          <w:bookmarkEnd w:id="55"/>
+          <w:bookmarkEnd w:id="50"/>
           <w:p/>
         </w:tc>
       </w:tr>
     </w:tbl>
-    <w:bookmarkEnd w:id="56"/>
-    <w:bookmarkStart w:id="57" w:name="full-analysis"/>
+    <w:bookmarkEnd w:id="51"/>
+    <w:bookmarkStart w:id="52" w:name="full-analysis"/>
     <w:p>
       <w:pPr>
         <w:pStyle w:val="Heading2"/>
@@ -2625,9 +2390,9 @@
         <w:br w:type="page"/>
       </w:r>
     </w:p>
-    <w:bookmarkEnd w:id="57"/>
-    <w:bookmarkEnd w:id="58"/>
-    <w:bookmarkStart w:id="63" w:name="discussion"/>
+    <w:bookmarkEnd w:id="52"/>
+    <w:bookmarkEnd w:id="53"/>
+    <w:bookmarkStart w:id="57" w:name="discussion"/>
     <w:p>
       <w:pPr>
         <w:pStyle w:val="Heading1"/>
@@ -2636,7 +2401,7 @@
         <w:t xml:space="preserve">5. Discussion</w:t>
       </w:r>
     </w:p>
-    <w:bookmarkStart w:id="59" w:name="summary-and-interpretation"/>
+    <w:bookmarkStart w:id="54" w:name="summary-and-interpretation"/>
     <w:p>
       <w:pPr>
         <w:pStyle w:val="Heading2"/>
@@ -2657,8 +2422,8 @@
         <w:t xml:space="preserve">Summarize what you did, what you found and what it means.</w:t>
       </w:r>
     </w:p>
-    <w:bookmarkEnd w:id="59"/>
-    <w:bookmarkStart w:id="60" w:name="strengths-and-limitations"/>
+    <w:bookmarkEnd w:id="54"/>
+    <w:bookmarkStart w:id="55" w:name="strengths-and-limitations"/>
     <w:p>
       <w:pPr>
         <w:pStyle w:val="Heading2"/>
@@ -2679,8 +2444,8 @@
         <w:t xml:space="preserve">Discuss what you perceive as strengths and limitations of your analysis.</w:t>
       </w:r>
     </w:p>
-    <w:bookmarkEnd w:id="60"/>
-    <w:bookmarkStart w:id="62" w:name="conclusions"/>
+    <w:bookmarkEnd w:id="55"/>
+    <w:bookmarkStart w:id="56" w:name="conclusions"/>
     <w:p>
       <w:pPr>
         <w:pStyle w:val="Heading2"/>
@@ -2714,75 +2479,13 @@
       </w:r>
     </w:p>
     <w:p>
-      <w:pPr>
-        <w:pStyle w:val="BodyText"/>
-      </w:pPr>
-      <w:r>
-        <w:t xml:space="preserve">This paper</w:t>
-      </w:r>
-      <w:r>
-        <w:t xml:space="preserve"> </w:t>
-      </w:r>
-      <w:r>
-        <w:t xml:space="preserve">(1)</w:t>
-      </w:r>
-      <w:r>
-        <w:t xml:space="preserve"> </w:t>
-      </w:r>
-      <w:r>
-        <w:t xml:space="preserve">discusses types of analyses.</w:t>
-      </w:r>
-    </w:p>
-    <w:p>
-      <w:pPr>
-        <w:pStyle w:val="BodyText"/>
-      </w:pPr>
-      <w:r>
-        <w:t xml:space="preserve">These papers</w:t>
-      </w:r>
-      <w:r>
-        <w:t xml:space="preserve"> </w:t>
-      </w:r>
-      <w:r>
-        <w:t xml:space="preserve">(2,3)</w:t>
-      </w:r>
-      <w:r>
-        <w:t xml:space="preserve"> </w:t>
-      </w:r>
-      <w:r>
-        <w:t xml:space="preserve">are good examples of papers published using a fully reproducible setup similar to the one shown in this template.</w:t>
-      </w:r>
-    </w:p>
-    <w:p>
-      <w:pPr>
-        <w:pStyle w:val="BodyText"/>
-      </w:pPr>
-      <w:r>
-        <w:t xml:space="preserve">Note that this cited reference will show up at the end of the document, the reference formatting is determined by the CSL file specified in the YAML header. Many more style files for almost any journal</w:t>
-      </w:r>
-      <w:r>
-        <w:t xml:space="preserve"> </w:t>
-      </w:r>
-      <w:hyperlink r:id="rId61">
-        <w:r>
-          <w:rPr>
-            <w:rStyle w:val="Hyperlink"/>
-          </w:rPr>
-          <w:t xml:space="preserve">are available</w:t>
-        </w:r>
-      </w:hyperlink>
-      <w:r>
-        <w:t xml:space="preserve">. You also specify the location of your BibTeX reference file in the YAML. You can call your reference file anything you like.</w:t>
-      </w:r>
-    </w:p>
-    <w:p>
       <w:r>
         <w:br w:type="page"/>
       </w:r>
     </w:p>
-    <w:bookmarkEnd w:id="62"/>
-    <w:bookmarkEnd w:id="63"/>
-    <w:bookmarkStart w:id="71" w:name="references"/>
+    <w:bookmarkEnd w:id="56"/>
+    <w:bookmarkEnd w:id="57"/>
+    <w:bookmarkStart w:id="58" w:name="references"/>
     <w:p>
       <w:pPr>
         <w:pStyle w:val="Heading1"/>
@@ -2791,261 +2494,7 @@
         <w:t xml:space="preserve">6. References</w:t>
       </w:r>
     </w:p>
-    <w:bookmarkStart w:id="70" w:name="refs"/>
-    <w:bookmarkStart w:id="65" w:name="ref-leek2015"/>
-    <w:p>
-      <w:pPr>
-        <w:pStyle w:val="Bibliography"/>
-      </w:pPr>
-      <w:r>
-        <w:t xml:space="preserve">1.</w:t>
-      </w:r>
-      <w:r>
-        <w:t xml:space="preserve"> </w:t>
-      </w:r>
-      <w:r>
-        <w:t xml:space="preserve">	</w:t>
-      </w:r>
-      <w:r>
-        <w:t xml:space="preserve">Leek JT, Peng RD.</w:t>
-      </w:r>
-      <w:r>
-        <w:t xml:space="preserve"> </w:t>
-      </w:r>
-      <w:hyperlink r:id="rId64">
-        <w:r>
-          <w:rPr>
-            <w:rStyle w:val="Hyperlink"/>
-          </w:rPr>
-          <w:t xml:space="preserve">Statistics.</w:t>
-        </w:r>
-        <w:r>
-          <w:rPr>
-            <w:rStyle w:val="Hyperlink"/>
-          </w:rPr>
-          <w:t xml:space="preserve"> </w:t>
-        </w:r>
-        <w:r>
-          <w:rPr>
-            <w:rStyle w:val="Hyperlink"/>
-          </w:rPr>
-          <w:t xml:space="preserve">What</w:t>
-        </w:r>
-        <w:r>
-          <w:rPr>
-            <w:rStyle w:val="Hyperlink"/>
-          </w:rPr>
-          <w:t xml:space="preserve"> </w:t>
-        </w:r>
-        <w:r>
-          <w:rPr>
-            <w:rStyle w:val="Hyperlink"/>
-          </w:rPr>
-          <w:t xml:space="preserve">is the question?</w:t>
-        </w:r>
-      </w:hyperlink>
-      <w:r>
-        <w:t xml:space="preserve"> </w:t>
-      </w:r>
-      <w:r>
-        <w:rPr>
-          <w:i/>
-          <w:iCs/>
-        </w:rPr>
-        <w:t xml:space="preserve">Science (New York, N.Y.)</w:t>
-      </w:r>
-      <w:r>
-        <w:t xml:space="preserve">. 2015;347(6228):1314–1315.</w:t>
-      </w:r>
-      <w:r>
-        <w:t xml:space="preserve"> </w:t>
-      </w:r>
-    </w:p>
-    <w:bookmarkEnd w:id="65"/>
-    <w:bookmarkStart w:id="67" w:name="ref-mckay2020"/>
-    <w:p>
-      <w:pPr>
-        <w:pStyle w:val="Bibliography"/>
-      </w:pPr>
-      <w:r>
-        <w:t xml:space="preserve">2.</w:t>
-      </w:r>
-      <w:r>
-        <w:t xml:space="preserve"> </w:t>
-      </w:r>
-      <w:r>
-        <w:t xml:space="preserve">	</w:t>
-      </w:r>
-      <w:r>
-        <w:t xml:space="preserve">McKay B, Ebell M, Billings WZ, et al.</w:t>
-      </w:r>
-      <w:r>
-        <w:t xml:space="preserve"> </w:t>
-      </w:r>
-      <w:hyperlink r:id="rId66">
-        <w:r>
-          <w:rPr>
-            <w:rStyle w:val="Hyperlink"/>
-          </w:rPr>
-          <w:t xml:space="preserve">Associations</w:t>
-        </w:r>
-        <w:r>
-          <w:rPr>
-            <w:rStyle w:val="Hyperlink"/>
-          </w:rPr>
-          <w:t xml:space="preserve"> </w:t>
-        </w:r>
-        <w:r>
-          <w:rPr>
-            <w:rStyle w:val="Hyperlink"/>
-          </w:rPr>
-          <w:t xml:space="preserve">Between Relative Viral Load</w:t>
-        </w:r>
-        <w:r>
-          <w:rPr>
-            <w:rStyle w:val="Hyperlink"/>
-          </w:rPr>
-          <w:t xml:space="preserve"> </w:t>
-        </w:r>
-        <w:r>
-          <w:rPr>
-            <w:rStyle w:val="Hyperlink"/>
-          </w:rPr>
-          <w:t xml:space="preserve">at</w:t>
-        </w:r>
-        <w:r>
-          <w:rPr>
-            <w:rStyle w:val="Hyperlink"/>
-          </w:rPr>
-          <w:t xml:space="preserve"> </w:t>
-        </w:r>
-        <w:r>
-          <w:rPr>
-            <w:rStyle w:val="Hyperlink"/>
-          </w:rPr>
-          <w:t xml:space="preserve">Diagnosis</w:t>
-        </w:r>
-        <w:r>
-          <w:rPr>
-            <w:rStyle w:val="Hyperlink"/>
-          </w:rPr>
-          <w:t xml:space="preserve"> </w:t>
-        </w:r>
-        <w:r>
-          <w:rPr>
-            <w:rStyle w:val="Hyperlink"/>
-          </w:rPr>
-          <w:t xml:space="preserve">and</w:t>
-        </w:r>
-        <w:r>
-          <w:rPr>
-            <w:rStyle w:val="Hyperlink"/>
-          </w:rPr>
-          <w:t xml:space="preserve"> </w:t>
-        </w:r>
-        <w:r>
-          <w:rPr>
-            <w:rStyle w:val="Hyperlink"/>
-          </w:rPr>
-          <w:t xml:space="preserve">Influenza A Symptoms</w:t>
-        </w:r>
-        <w:r>
-          <w:rPr>
-            <w:rStyle w:val="Hyperlink"/>
-          </w:rPr>
-          <w:t xml:space="preserve"> </w:t>
-        </w:r>
-        <w:r>
-          <w:rPr>
-            <w:rStyle w:val="Hyperlink"/>
-          </w:rPr>
-          <w:t xml:space="preserve">and</w:t>
-        </w:r>
-        <w:r>
-          <w:rPr>
-            <w:rStyle w:val="Hyperlink"/>
-          </w:rPr>
-          <w:t xml:space="preserve"> </w:t>
-        </w:r>
-        <w:r>
-          <w:rPr>
-            <w:rStyle w:val="Hyperlink"/>
-          </w:rPr>
-          <w:t xml:space="preserve">Recovery</w:t>
-        </w:r>
-        <w:r>
-          <w:rPr>
-            <w:rStyle w:val="Hyperlink"/>
-          </w:rPr>
-          <w:t xml:space="preserve">.</w:t>
-        </w:r>
-      </w:hyperlink>
-      <w:r>
-        <w:t xml:space="preserve"> </w:t>
-      </w:r>
-      <w:r>
-        <w:rPr>
-          <w:i/>
-          <w:iCs/>
-        </w:rPr>
-        <w:t xml:space="preserve">Open forum infectious diseases</w:t>
-      </w:r>
-      <w:r>
-        <w:t xml:space="preserve">. 2020;7(11):ofaa494.</w:t>
-      </w:r>
-      <w:r>
-        <w:t xml:space="preserve"> </w:t>
-      </w:r>
-    </w:p>
-    <w:bookmarkEnd w:id="67"/>
-    <w:bookmarkStart w:id="69" w:name="ref-mckay2020a"/>
-    <w:p>
-      <w:pPr>
-        <w:pStyle w:val="Bibliography"/>
-      </w:pPr>
-      <w:r>
-        <w:t xml:space="preserve">3.</w:t>
-      </w:r>
-      <w:r>
-        <w:t xml:space="preserve"> </w:t>
-      </w:r>
-      <w:r>
-        <w:t xml:space="preserve">	</w:t>
-      </w:r>
-      <w:r>
-        <w:t xml:space="preserve">McKay B, Ebell M, Dale AP, et al.</w:t>
-      </w:r>
-      <w:r>
-        <w:t xml:space="preserve"> </w:t>
-      </w:r>
-      <w:hyperlink r:id="rId68">
-        <w:r>
-          <w:rPr>
-            <w:rStyle w:val="Hyperlink"/>
-          </w:rPr>
-          <w:t xml:space="preserve">Virulence-mediated infectiousness and activity trade-offs and their impact on transmission potential of influenza patients.</w:t>
-        </w:r>
-      </w:hyperlink>
-      <w:r>
-        <w:t xml:space="preserve"> </w:t>
-      </w:r>
-      <w:r>
-        <w:rPr>
-          <w:i/>
-          <w:iCs/>
-        </w:rPr>
-        <w:t xml:space="preserve">Proceedings. Biological sciences</w:t>
-      </w:r>
-      <w:r>
-        <w:t xml:space="preserve">. 2020;287(1927):20200496.</w:t>
-      </w:r>
-      <w:r>
-        <w:t xml:space="preserve"> </w:t>
-      </w:r>
-    </w:p>
-    <w:bookmarkEnd w:id="69"/>
-    <w:bookmarkEnd w:id="70"/>
-    <w:bookmarkEnd w:id="71"/>
+    <w:bookmarkEnd w:id="58"/>
     <w:sectPr>
       <w:footnotePr>
         <w:numRestart w:val="eachSect"/>

</xml_diff>

<commit_message>
Project Part 4 Commit 2
</commit_message>
<xml_diff>
--- a/products/manuscript/Manuscript.docx
+++ b/products/manuscript/Manuscript.docx
@@ -891,7 +891,7 @@
     </w:p>
     <w:bookmarkEnd w:id="28"/>
     <w:bookmarkEnd w:id="29"/>
-    <w:bookmarkStart w:id="53" w:name="results"/>
+    <w:bookmarkStart w:id="61" w:name="results"/>
     <w:p>
       <w:pPr>
         <w:pStyle w:val="Heading1"/>
@@ -2339,7 +2339,7 @@
       </w:tr>
     </w:tbl>
     <w:bookmarkEnd w:id="51"/>
-    <w:bookmarkStart w:id="52" w:name="full-analysis"/>
+    <w:bookmarkStart w:id="60" w:name="full-analysis"/>
     <w:p>
       <w:pPr>
         <w:pStyle w:val="Heading2"/>
@@ -2353,11 +2353,7 @@
         <w:pStyle w:val="FirstParagraph"/>
       </w:pPr>
       <w:r>
-        <w:rPr>
-          <w:i/>
-          <w:iCs/>
-        </w:rPr>
-        <w:t xml:space="preserve">Use one or several suitable statistical/machine learning methods to analyze your data and to produce meaningful figures, tables, etc. This might again be code that is best placed in one or several separate R scripts that need to be well documented. You want the code to produce figures and data ready for display as tables, and save those. Then you load them here.</w:t>
+        <w:t xml:space="preserve">To explore patterns in peanut variety performance, an unsupervised machine learning approach was applied using k-means clustering. Prior to clustering, yield data were summarized at the variety level to capture key performance characteristics, including average yield, yield variability (standard deviation), and responsiveness to irrigation (difference between irrigated and non-irrigated yield). These features were selected to represent productivity, stability, and environmental responsiveness, which are important traits in agricultural systems.</w:t>
       </w:r>
     </w:p>
     <w:p>
@@ -2365,34 +2361,183 @@
         <w:pStyle w:val="BodyText"/>
       </w:pPr>
       <w:r>
-        <w:t xml:space="preserve">Example</w:t>
-      </w:r>
-      <w:r>
-        <w:t xml:space="preserve"> </w:t>
-      </w:r>
-      <w:hyperlink w:anchor="tbl-resulttable2">
-        <w:r>
-          <w:rPr>
-            <w:rStyle w:val="Hyperlink"/>
-          </w:rPr>
-          <w:t xml:space="preserve">Table 3</w:t>
-        </w:r>
-      </w:hyperlink>
-      <w:r>
-        <w:t xml:space="preserve"> </w:t>
-      </w:r>
-      <w:r>
-        <w:t xml:space="preserve">shows a summary of a linear model fit.</w:t>
-      </w:r>
-    </w:p>
+        <w:t xml:space="preserve">Because these variables were measured on different scales, all features were standardized prior to analysis. The optimal number of clusters was determined using the elbow method, which evaluates within-cluster sum of squares (WSS) across different values of k. A noticeable reduction in WSS was observed up to k = 4, after which improvements diminished, and thus three clusters were selected.</w:t>
+      </w:r>
+    </w:p>
+    <w:tbl>
+      <w:tblPr>
+        <w:tblStyle w:val="Table"/>
+        <w:tblW w:type="pct" w:w="5000"/>
+        <w:tblLayout w:type="fixed"/>
+        <w:tblLook w:firstRow="0" w:lastRow="0" w:firstColumn="0" w:lastColumn="0" w:noHBand="0" w:noVBand="0" w:val="0000"/>
+      </w:tblPr>
+      <w:tblGrid>
+        <w:gridCol w:w="7920"/>
+      </w:tblGrid>
+      <w:tr>
+        <w:tc>
+          <w:tcPr/>
+          <w:bookmarkStart w:id="55" w:name="fig-elbow_plot"/>
+          <w:p>
+            <w:pPr>
+              <w:pStyle w:val="Compact"/>
+              <w:jc w:val="center"/>
+            </w:pPr>
+            <w:r>
+              <w:drawing>
+                <wp:inline>
+                  <wp:extent cx="5334000" cy="5334000"/>
+                  <wp:effectExtent b="0" l="0" r="0" t="0"/>
+                  <wp:docPr descr="" title="" id="53" name="Picture"/>
+                  <a:graphic>
+                    <a:graphicData uri="http://schemas.openxmlformats.org/drawingml/2006/picture">
+                      <pic:pic>
+                        <pic:nvPicPr>
+                          <pic:cNvPr descr="../../results/figures/elbow.png" id="54" name="Picture"/>
+                          <pic:cNvPicPr>
+                            <a:picLocks noChangeArrowheads="1" noChangeAspect="1"/>
+                          </pic:cNvPicPr>
+                        </pic:nvPicPr>
+                        <pic:blipFill>
+                          <a:blip r:embed="rId52"/>
+                          <a:stretch>
+                            <a:fillRect/>
+                          </a:stretch>
+                        </pic:blipFill>
+                        <pic:spPr bwMode="auto">
+                          <a:xfrm>
+                            <a:off x="0" y="0"/>
+                            <a:ext cx="5334000" cy="5334000"/>
+                          </a:xfrm>
+                          <a:prstGeom prst="rect">
+                            <a:avLst/>
+                          </a:prstGeom>
+                          <a:noFill/>
+                          <a:ln w="9525">
+                            <a:noFill/>
+                            <a:headEnd/>
+                            <a:tailEnd/>
+                          </a:ln>
+                        </pic:spPr>
+                      </pic:pic>
+                    </a:graphicData>
+                  </a:graphic>
+                </wp:inline>
+              </w:drawing>
+            </w:r>
+          </w:p>
+          <w:p>
+            <w:pPr>
+              <w:jc w:val="center"/>
+            </w:pPr>
+            <w:pPr>
+              <w:jc w:val="left"/>
+              <w:spacing w:before="200"/>
+              <w:pStyle w:val="ImageCaption"/>
+            </w:pPr>
+            <w:r>
+              <w:t xml:space="preserve">Figure 5: Determination of the optimal number of clusters using the elbow method. The within-cluster sum of squares (WSS) is plotted against the number of clusters (k).</w:t>
+            </w:r>
+          </w:p>
+          <w:bookmarkEnd w:id="55"/>
+        </w:tc>
+      </w:tr>
+    </w:tbl>
+    <w:p>
+      <w:pPr>
+        <w:pStyle w:val="BodyText"/>
+      </w:pPr>
+      <w:r>
+        <w:t xml:space="preserve">Principal component analysis (PCA) was used to visualize the clustering results in reduced dimensional space. The first two principal components explained a substantial proportion of the variation in the data, allowing clear separation of the identified clusters. These clusters corresponded to biologically meaningful groupings of peanut varieties, including high-yielding but variable varieties with strong irrigation response, more stable varieties with lower responsiveness, and intermediate-performing varieties. This suggests that clustering effectively captured key differences in yield performance and stability among varieties.</w:t>
+      </w:r>
+    </w:p>
+    <w:tbl>
+      <w:tblPr>
+        <w:tblStyle w:val="Table"/>
+        <w:tblW w:type="pct" w:w="5000"/>
+        <w:tblLayout w:type="fixed"/>
+        <w:tblLook w:firstRow="0" w:lastRow="0" w:firstColumn="0" w:lastColumn="0" w:noHBand="0" w:noVBand="0" w:val="0000"/>
+      </w:tblPr>
+      <w:tblGrid>
+        <w:gridCol w:w="7920"/>
+      </w:tblGrid>
+      <w:tr>
+        <w:tc>
+          <w:tcPr/>
+          <w:bookmarkStart w:id="59" w:name="fig-pca_plot"/>
+          <w:p>
+            <w:pPr>
+              <w:pStyle w:val="Compact"/>
+              <w:jc w:val="center"/>
+            </w:pPr>
+            <w:r>
+              <w:drawing>
+                <wp:inline>
+                  <wp:extent cx="5334000" cy="5334000"/>
+                  <wp:effectExtent b="0" l="0" r="0" t="0"/>
+                  <wp:docPr descr="" title="" id="57" name="Picture"/>
+                  <a:graphic>
+                    <a:graphicData uri="http://schemas.openxmlformats.org/drawingml/2006/picture">
+                      <pic:pic>
+                        <pic:nvPicPr>
+                          <pic:cNvPr descr="../../results/figures/pca.png" id="58" name="Picture"/>
+                          <pic:cNvPicPr>
+                            <a:picLocks noChangeArrowheads="1" noChangeAspect="1"/>
+                          </pic:cNvPicPr>
+                        </pic:nvPicPr>
+                        <pic:blipFill>
+                          <a:blip r:embed="rId56"/>
+                          <a:stretch>
+                            <a:fillRect/>
+                          </a:stretch>
+                        </pic:blipFill>
+                        <pic:spPr bwMode="auto">
+                          <a:xfrm>
+                            <a:off x="0" y="0"/>
+                            <a:ext cx="5334000" cy="5334000"/>
+                          </a:xfrm>
+                          <a:prstGeom prst="rect">
+                            <a:avLst/>
+                          </a:prstGeom>
+                          <a:noFill/>
+                          <a:ln w="9525">
+                            <a:noFill/>
+                            <a:headEnd/>
+                            <a:tailEnd/>
+                          </a:ln>
+                        </pic:spPr>
+                      </pic:pic>
+                    </a:graphicData>
+                  </a:graphic>
+                </wp:inline>
+              </w:drawing>
+            </w:r>
+          </w:p>
+          <w:p>
+            <w:pPr>
+              <w:jc w:val="center"/>
+            </w:pPr>
+            <w:pPr>
+              <w:jc w:val="left"/>
+              <w:spacing w:before="200"/>
+              <w:pStyle w:val="ImageCaption"/>
+            </w:pPr>
+            <w:r>
+              <w:t xml:space="preserve">Figure 6: Principal component analysis (PCA) of peanut varieties based on yield-related traits. Varieties are grouped using k-means clustering (k = 3), with each point representing a variety.</w:t>
+            </w:r>
+          </w:p>
+          <w:bookmarkEnd w:id="59"/>
+        </w:tc>
+      </w:tr>
+    </w:tbl>
     <w:p>
       <w:r>
         <w:br w:type="page"/>
       </w:r>
     </w:p>
-    <w:bookmarkEnd w:id="52"/>
-    <w:bookmarkEnd w:id="53"/>
-    <w:bookmarkStart w:id="57" w:name="discussion"/>
+    <w:bookmarkEnd w:id="60"/>
+    <w:bookmarkEnd w:id="61"/>
+    <w:bookmarkStart w:id="65" w:name="discussion"/>
     <w:p>
       <w:pPr>
         <w:pStyle w:val="Heading1"/>
@@ -2401,7 +2546,7 @@
         <w:t xml:space="preserve">5. Discussion</w:t>
       </w:r>
     </w:p>
-    <w:bookmarkStart w:id="54" w:name="summary-and-interpretation"/>
+    <w:bookmarkStart w:id="62" w:name="summary-and-interpretation"/>
     <w:p>
       <w:pPr>
         <w:pStyle w:val="Heading2"/>
@@ -2422,8 +2567,8 @@
         <w:t xml:space="preserve">Summarize what you did, what you found and what it means.</w:t>
       </w:r>
     </w:p>
-    <w:bookmarkEnd w:id="54"/>
-    <w:bookmarkStart w:id="55" w:name="strengths-and-limitations"/>
+    <w:bookmarkEnd w:id="62"/>
+    <w:bookmarkStart w:id="63" w:name="strengths-and-limitations"/>
     <w:p>
       <w:pPr>
         <w:pStyle w:val="Heading2"/>
@@ -2444,8 +2589,8 @@
         <w:t xml:space="preserve">Discuss what you perceive as strengths and limitations of your analysis.</w:t>
       </w:r>
     </w:p>
-    <w:bookmarkEnd w:id="55"/>
-    <w:bookmarkStart w:id="56" w:name="conclusions"/>
+    <w:bookmarkEnd w:id="63"/>
+    <w:bookmarkStart w:id="64" w:name="conclusions"/>
     <w:p>
       <w:pPr>
         <w:pStyle w:val="Heading2"/>
@@ -2483,9 +2628,9 @@
         <w:br w:type="page"/>
       </w:r>
     </w:p>
-    <w:bookmarkEnd w:id="56"/>
-    <w:bookmarkEnd w:id="57"/>
-    <w:bookmarkStart w:id="58" w:name="references"/>
+    <w:bookmarkEnd w:id="64"/>
+    <w:bookmarkEnd w:id="65"/>
+    <w:bookmarkStart w:id="66" w:name="references"/>
     <w:p>
       <w:pPr>
         <w:pStyle w:val="Heading1"/>
@@ -2494,7 +2639,7 @@
         <w:t xml:space="preserve">6. References</w:t>
       </w:r>
     </w:p>
-    <w:bookmarkEnd w:id="58"/>
+    <w:bookmarkEnd w:id="66"/>
     <w:sectPr>
       <w:footnotePr>
         <w:numRestart w:val="eachSect"/>

</xml_diff>